<commit_message>
ARcGIS Online update code
</commit_message>
<xml_diff>
--- a/notebooks/Water_summary_samples_final_report_20240515.docx
+++ b/notebooks/Water_summary_samples_final_report_20240515.docx
@@ -13,7 +13,7 @@
         <w:t xml:space="preserve"> </w:t>
       </w:r>
       <w:r>
-        <w:t xml:space="preserve">Date</w:t>
+        <w:t xml:space="preserve">Data</w:t>
       </w:r>
       <w:r>
         <w:t xml:space="preserve"> </w:t>
@@ -43,7 +43,7 @@
         <w:t xml:space="preserve"> </w:t>
       </w:r>
       <w:r>
-        <w:t xml:space="preserve">call</w:t>
+        <w:t xml:space="preserve">Call</w:t>
       </w:r>
       <w:r>
         <w:t xml:space="preserve"> </w:t>
@@ -72,13 +72,13 @@
         <w:pStyle w:val="FirstParagraph"/>
       </w:pPr>
       <w:r>
-        <w:t xml:space="preserve">This is to document the processing steps in preparing the summary water data for submission to spring 2024 Data Call. This follows the How-to-Guide and Data Dictionary 2024. To get an undrestanding about names and/or rules please refer to those documents.</w:t>
-      </w:r>
-      <w:r>
-        <w:t xml:space="preserve"> </w:t>
-      </w:r>
-      <w:r>
-        <w:t xml:space="preserve">The process was started with the unaggregated file(.xlsx) received from NDEE on 5/14/2024. That contained 11,761 rows of data. Both sampling data and PWS Inventory were validated using the python codes. 28 of PWS inventoris had validation errors of not containing values for Latitude, Longitude, and LocationDerivationCode (included them in PWSInventory_2024_errors.csv file attachec to the same email. This is similar to what happened last year, when two sets of inventory datasets were provided and the earliest file haa all the data. I therefore used that earlier inventory file from last to ONLY replace the missed field values for the inventories.</w:t>
+        <w:t xml:space="preserve">This write-up documents the processing steps in preparing the summary water data for submission to the spring 2024 Data Call. This follows the How-to-Guide and Data Dictionary 2024. To get an understanding of names and/or rules please refer to those documents.</w:t>
+      </w:r>
+      <w:r>
+        <w:t xml:space="preserve"> </w:t>
+      </w:r>
+      <w:r>
+        <w:t xml:space="preserve">The process was started with the unaggregated file(.xlsx) received from NDEE on 5/14/2024. That contained 11,761 rows of data. Both sampling data and PWS Inventory were validated using the Python codes. 28 of the PWS inventories had validation errors of not containing values for Latitude, Longitude, and LocationDerivationCode (included them in the PWSInventory_2024_errors.csv file attached to the same email. This is similar to last year, when two sets of inventory datasets were provided and the earliest file had all the data. I therefore used that earlier inventory file from last to ONLY replace the missed field values for the inventories.</w:t>
       </w:r>
     </w:p>
     <w:p>
@@ -772,14 +772,6 @@
     <w:p>
       <w:pPr>
         <w:pStyle w:val="FirstParagraph"/>
-      </w:pPr>
-      <w:r>
-        <w:t xml:space="preserve">All none detect values (4965) are changed into half LDL. But some of DLs are zero. While HTG requires that:</w:t>
-      </w:r>
-    </w:p>
-    <w:p>
-      <w:pPr>
-        <w:pStyle w:val="BodyText"/>
       </w:pPr>
       <w:r>
         <w:t xml:space="preserve">“</w:t>

</xml_diff>